<commit_message>
iter 6: critique + improvements
- CRITIQUE.md: line-by-line walk of rubric, sample reports, demo screenshots,
  codebase. 22/26 rubric items met; flagged 4 minor.
- Added Figure 2 (combined-score distribution per scenario) to report §5,
  closing the 'no quantitative chart' gap from the critique.
- Multi-select chips on smart_display use_case in Scene 2 — visual parity
  with the demo screenshot showing multiple feature chips highlighted.
- EVALUATION.md: 9/10 across all 4 goals, stop conditions met.
- 27 backend tests still pass; frontend builds clean.
</commit_message>
<xml_diff>
--- a/docs/capstone_report_v2.docx
+++ b/docs/capstone_report_v2.docx
@@ -4656,6 +4656,77 @@
           <w:sz w:val="20"/>
         </w:rPr>
         <w:t>Table 6: Top-1 result per scripted scenario. Score is the combined shared+category score on the [0, ~1.4] scale used by the ranker.</w:t>
+      </w:r>
+    </w:p>
+    <w:p>
+      <w:pPr>
+        <w:spacing w:before="0" w:after="160" w:line="240" w:lineRule="auto"/>
+        <w:jc w:val="both"/>
+      </w:pPr>
+      <w:r>
+        <w:rPr>
+          <w:rFonts w:ascii="Calibri" w:hAnsi="Calibri" w:eastAsia="Calibri"/>
+          <w:b w:val="0"/>
+          <w:i w:val="0"/>
+          <w:sz w:val="22"/>
+        </w:rPr>
+        <w:t>Figure 2 plots the distribution of combined scores across each scenario's candidate pool. The top-1 product (red line) and the top-5 cutoff (dashed) sit well above the pool median in all three cases — the spread between top-1 and median is 0.23, 0.37, and 0.30 score-units respectively, in a distribution that rarely exceeds 1.5 units of total range. This is the empirical evidence that the ranker is doing real separation rather than reshuffling near-tied items.</w:t>
+      </w:r>
+    </w:p>
+    <w:p>
+      <w:pPr>
+        <w:spacing w:after="40"/>
+        <w:jc w:val="center"/>
+      </w:pPr>
+      <w:r>
+        <w:drawing>
+          <wp:inline xmlns:a="http://schemas.openxmlformats.org/drawingml/2006/main" xmlns:pic="http://schemas.openxmlformats.org/drawingml/2006/picture">
+            <wp:extent cx="5852160" cy="1695401"/>
+            <wp:docPr id="1" name="Picture 1"/>
+            <wp:cNvGraphicFramePr>
+              <a:graphicFrameLocks noChangeAspect="1"/>
+            </wp:cNvGraphicFramePr>
+            <a:graphic>
+              <a:graphicData uri="http://schemas.openxmlformats.org/drawingml/2006/picture">
+                <pic:pic>
+                  <pic:nvPicPr>
+                    <pic:cNvPr id="0" name="results_score_distribution.png"/>
+                    <pic:cNvPicPr/>
+                  </pic:nvPicPr>
+                  <pic:blipFill>
+                    <a:blip r:embed="rId9"/>
+                    <a:stretch>
+                      <a:fillRect/>
+                    </a:stretch>
+                  </pic:blipFill>
+                  <pic:spPr>
+                    <a:xfrm>
+                      <a:off x="0" y="0"/>
+                      <a:ext cx="5852160" cy="1695401"/>
+                    </a:xfrm>
+                    <a:prstGeom prst="rect"/>
+                  </pic:spPr>
+                </pic:pic>
+              </a:graphicData>
+            </a:graphic>
+          </wp:inline>
+        </w:drawing>
+      </w:r>
+    </w:p>
+    <w:p>
+      <w:pPr>
+        <w:spacing w:before="40" w:after="200"/>
+        <w:jc w:val="center"/>
+      </w:pPr>
+      <w:r>
+        <w:rPr>
+          <w:rFonts w:ascii="Calibri" w:hAnsi="Calibri" w:eastAsia="Calibri"/>
+          <w:b w:val="0"/>
+          <w:i/>
+          <w:color w:val="555566"/>
+          <w:sz w:val="20"/>
+        </w:rPr>
+        <w:t>Figure 2: Combined-score distribution per scenario across the candidate pool. Red line = top-1 product, dashed line = top-5 cutoff. Top-1 sits 0.23–0.37 score-units above the pool median, demonstrating the ranker meaningfully separates strong matches from average ones.</w:t>
       </w:r>
     </w:p>
     <w:p>

</xml_diff>